<commit_message>
updated the country profile for Nigeria and United States
</commit_message>
<xml_diff>
--- a/server/data_scripts/country_profiles_source/country_profile_section_of_our_international_observatory_website.docx
+++ b/server/data_scripts/country_profiles_source/country_profile_section_of_our_international_observatory_website.docx
@@ -4438,12 +4438,22 @@
     </w:p>
     <w:p>
       <w:r>
-        <w:t>Nigeria's foundational collective trauma is the 1967–1970 Nigeria-Biafra War, during which pogroms, blockade-induced famine, and military defeat inflicted profound collective trauma on Igbo communities, a wound that remained a taboo subject in national discourse for decades (Heerten, 2014; Osisioma, 2025).</w:t>
-      </w:r>
-    </w:p>
-    <w:p>
-      <w:r>
-        <w:t>This buried historical trauma intersects directly with contemporary crises, as northern Nigeria's ongoing Boko Haram insurgency has generated a new, overlapping trauma landscape, with researchers noting that biomedical PTSD frameworks alone fail to capture the full social and communal dimensions of trauma experienced across both conflicts (Social Science in Action, 2024; Stellenbosch Institute, 2024).</w:t>
+        <w:t>Nigeria's collective trauma did not begin in 1967. Long before the Biafran War, the landmass and peoples now called Nigeria had already absorbed successive waves of conquest and subjugation that established defeat, subjugation, and forced political reordering as recurring features of collective memory. Between 1804 and 1810, Usman dan Fodio's jihad swept through Hausaland, militarily defeating the Hausa kingdoms and subjecting them to Fulani ideological and political rule under the newly founded Sokoto Caliphate, one of the largest empires in African history at the time (Britannica, 2026; Usman dan Fodio, n.d.). A century later, this same region absorbed a second conquest: British colonial forces captured Kano and Sokoto between 1901 and 1903, formally dismantling the Caliphate's sovereignty and folding it into the Protectorate of Northern Nigeria after six years of sustained armed resistance (Colonial Nigeria, n.d.; Dusgate, 2025). Beyond the north, the historical record includes the conquest and fall of the Benin Kingdom and recurring wars among Igbo kingdoms and other ethnic polities, meaning that by the time Nigeria existed as a colonial construct, its constituent peoples had already experienced multiple, distinct historical layers of military defeat, foreign ideological imposition, and loss of self-governance.</w:t>
+      </w:r>
+    </w:p>
+    <w:p>
+      <w:r>
+        <w:t>The 1967–1970 Nigeria-Biafra War did not introduce trauma into a previously unwounded nation; it exacerbated a collective trauma load that pre-existed the war by more than a century. Pogroms against Igbo civilians, a blockade-induced famine, and eventual military defeat inflicted profound and additional collective trauma on Igbo communities specifically, layering a modern, ethnically-targeted wound atop the older, broader pattern of conquest and subjugation already embedded in the national psyche (Heerten &amp; Moses, 2014; Osisioma, 2025). This is why the Biafran War became a taboo subject in national discourse for decades: it was not an isolated historical rupture but the most recent and most acutely documented instance of a defeat-and-suppression pattern Nigerians had already lived through in earlier form.</w:t>
+      </w:r>
+    </w:p>
+    <w:p>
+      <w:r>
+        <w:t>This layered history matters clinically, not just historically. As collective trauma research increasingly demonstrates, wars outlive the geography and generation in which they were fought; they persist in memory, identity, family narrative, and national storytelling, and emerging epigenetic research suggests they may also leave biological marks passed across generations through altered gene expression, even absent direct memory of the originating event (Yehuda et al., 2018; Gemmati et al., 2025). For a nation as large and consequential as Nigeria, addressing the emotional aftermath of the civil war cannot be treated as an isolated historical reckoning. It must be understood as one layer within a longer, compounding sequence of collective defeat, dating back through British colonial conquest to the Fulani jihad, each layer reinforcing patterns of distrust, unresolved grief, and fractured national cohesion that later conflicts have only intensified.</w:t>
+      </w:r>
+    </w:p>
+    <w:p>
+      <w:r>
+        <w:t>Northern Nigeria's ongoing Boko Haram insurgency represents the newest chapter in this same historical continuum rather than a disconnected contemporary crisis. Researchers note that biomedical PTSD frameworks alone fail to capture the full social and communal dimensions of trauma experienced across the region's overlapping conflicts, precisely because the insurgency unfolds in the same northern territory shaped by both the Sokoto jihad and the British conquest, adding a third major layer of defeat, displacement, and communal rupture to land and peoples already carrying two prior historical wounds (Social Science in Action, 2024; Stellenbosch Institute, 2024).</w:t>
       </w:r>
     </w:p>
     <w:p>
@@ -6527,12 +6537,72 @@
     </w:p>
     <w:p>
       <w:r>
-        <w:t>The United States' collective trauma includes the genocide and forced displacement of Indigenous peoples, chattel slavery and its Jim Crow-era aftermath, and periodic mass-casualty events including the Civil War and 9/11 terrorist attacks.</w:t>
-      </w:r>
-    </w:p>
-    <w:p>
-      <w:r>
-        <w:t>Contemporary American society continues to experience the compounding aftermath of these historical traumas through persistent racial health and incarceration disparities, alongside documented intergenerational trauma transmission among Native American and Alaska Native communities linked directly to historical colonization and forced removal policies.</w:t>
+        <w:t>Ask ten people what America's collective trauma is and you'll get ten different answers, and honestly, all of them would be partly right. There's no single wound here. It's more like sediment — layer after layer, laid down over centuries, and none of it ever really washes away.</w:t>
+      </w:r>
+    </w:p>
+    <w:p>
+      <w:r>
+        <w:t>Start at the bottom, with what happened to Indigenous nations. This wasn't one policy, it was two working together: extermination on one hand, forced assimilation on the other, both aimed at the same outcome — making Native peoples disappear, one way or another (Journal of Ethics, 2021). The Indian Removal Act pushed close to 100,000 people off their land. Later came the boarding schools, built for one purpose: strip children of language and culture before they were old enough to resist. By 1890 the Native population inside U.S. borders had fallen to around 250,000. Disease did some of that. So did war, forced removal, broken treaties, and, not to put too fine a point on it, homicide (California State University, n.d.).</w:t>
+      </w:r>
+    </w:p>
+    <w:p>
+      <w:r>
+        <w:t>Then slavery, and after slavery, Jim Crow — a century of legal successor doing much of the same work under a different name. There's actually a clinical term for what this produced: Post Traumatic Slave Syndrome, harm that travels through families via parenting style, through household stress, even through biology (Scott-Jones et al., 2020). This isn't ancient history sitting quietly in a textbook. It's in the health outcomes right now. It's in who ends up incarcerated and who doesn't. It's in whether someone trusts a hospital or a police officer, and researchers keep tracing that distrust straight back to this same policy lineage (Scott-Jones et al., 2020).</w:t>
+      </w:r>
+    </w:p>
+    <w:p>
+      <w:r>
+        <w:t>And then there's a third kind of trauma altogether — not slow and structural, but sudden. Loud. The kind that happens in an afternoon and changes everything after.</w:t>
+      </w:r>
+    </w:p>
+    <w:p>
+      <w:r>
+        <w:t>September 11 is the obvious one. Scholars studying it call it a genuine cultural trauma, something that rewired collective memory and public ritual almost overnight (Claremont Colleges, n.d.). But it never really closed. The Boston Marathon bombing, a long string of smaller domestic attacks in the years since — each one reopened the same nerve.</w:t>
+      </w:r>
+    </w:p>
+    <w:p>
+      <w:r>
+        <w:t>War runs right alongside that, and honestly, it starts earlier than most people think to place it. Vietnam is where the whole clinical concept of PTSD basically came from. The National Vietnam Veterans Readjustment Study found about 15% of male theater veterans carried PTSD, and when researchers went back and checked again 40, even 50 years later, a real chunk of those men were still dealing with it — some for the first time in old age (Magruder et al., 2016; VA Public Health, 2015; Columbia Public Health, 2025). It didn't stop with them, either. Their kids show documented signs of inherited trauma too, sometimes from watching a father struggle, sometimes just from growing up in a house where nobody talked about what happened over there (Dekel &amp; Goldblatt, 2008; Pacifica Graduate Institute, 2020). Iraq and Afghanistan did it again a generation later — thousands of service members killed, and families left holding a grief that's still not well understood or well studied. Spouses and kids of deployed troops show real, measurable increases in PTSD and anxiety, even when they never left home (Kaplow et al., 2013; Chesmore &amp; Gewirtz, n.d.). Three wars, three generations, and pretty much the same mechanism each time: trauma moving through biology, through learned behavior, through what does and doesn't get said at the dinner table (Veterans Breakfast Club, 2024).</w:t>
+      </w:r>
+    </w:p>
+    <w:p>
+      <w:r>
+        <w:t>Natural disasters deserve their own paragraph here, because the U.S. has been getting hit by them, hard, for a very long time. Galveston in 1900 is still the deadliest natural disaster in American history — somewhere between 8,000 and 12,000 people died in a single storm (Galveston Storm, 2024). The Dust Bowl pushed half a million people off land that could no longer support them (Evergreen University, 2024). Katrina, in 2005, wasn't just a hurricane — it wiped out the community networks people would normally lean on to recover, which is a big part of why survivors were still showing elevated depression and PTSD years afterward (Rhodes et al., 2010). Sandy, Harvey, and Maria in Puerto Rico followed a similar script; Maria in particular gets described by researchers as the worst disaster in that island's history (Fitzpatrick, 2021; Macias, 2021). Even something as geographically contained as the 2011 Joplin tornado left survivors with elevated PTSD two and a half years out (Adams et al., 2022). And now California's wildfire seasons are doing the same thing on a rolling basis — the 2018 Camp Fire, the 2025 LA fires — where each new fire triggers memories of the last one before people have even finished processing it (Nan et al., 2025).</w:t>
+      </w:r>
+    </w:p>
+    <w:p>
+      <w:r>
+        <w:t>Mass shootings are, unfortunately, close to a uniquely American phenomenon in terms of sheer frequency, and researchers have started describing them as a kind of rupture the whole country absorbs, not just the people in the room. Part of that's the 9/11-adjacent anxiety they tap into. Part of it's social media, which has basically built a shared grief ritual that gets triggered fresh every single time (Somatosphere, 2016; American Psychological Association, 2022). Communities that deal with chronic gun violence carry this as a slow burn rather than a single spike (Everytown Research, 2025).</w:t>
+      </w:r>
+    </w:p>
+    <w:p>
+      <w:r>
+        <w:t>Then there's opioids. Over 100,000 Americans a year, dying from overdose. And the relationship with trauma runs both directions — people with pre-existing trauma are more likely to develop opioid use disorder, and the epidemic itself keeps generating new trauma, including among the paramedics and first responders who show up to the same overdose scenes over and over (Volkow et al., 2020; Jeffries-Baxter et al., 2024).</w:t>
+      </w:r>
+    </w:p>
+    <w:p>
+      <w:r>
+        <w:t>COVID is its own category, and it's a big one — over 1.2 million dead. Researchers have flat-out called it a collective trauma, distinct from other causes of mass death because of how total it was: everyone, everywhere, at the same time (Stanford Medicine, 2022). One estimate puts the number of Americans meaningfully affected by a COVID death, not counting the deaths themselves, at roughly nine grieving family members per death — which puts the real bereavement number somewhere in the tens of millions (Verdery et al., 2020).</w:t>
+      </w:r>
+    </w:p>
+    <w:p>
+      <w:r>
+        <w:t>Homelessness belongs on this list too, and it's often left off. About 800,000 Americans don't have housing on any given night, and researchers now increasingly treat homelessness itself as traumatic, not just something that happens after a trauma. Nearly three in four people experiencing homelessness report surviving physical violence at some point in their lives (National Child Traumatic Stress Network, n.d.; California Health Care Foundation, 2025).</w:t>
+      </w:r>
+    </w:p>
+    <w:p>
+      <w:r>
+        <w:t>Political polarization is the strange one on this list, because it isn't an event at all — it's a condition the country's been living inside for years now. Studies tracking this over time have linked the emotional hostility between Republicans and Democrats to real declines in individual wellbeing, and at a societal level it's eroding trust in institutions in a way that starts to resemble what happens after other collective traumas (Oxford Academic, 2024). Some researchers now argue polarization doesn't just cause new harm — it reopens older wounds that were never fully resolved (Wagner et al., 2022).</w:t>
+      </w:r>
+    </w:p>
+    <w:p>
+      <w:r>
+        <w:t>And then there's something newer still, something I'd argue doesn't get talked about enough: how Americans are perceived and treated once they leave the country. Recent survey data found that 72% of experienced American travelers now expect to be viewed more negatively abroad, and a lot of them are actively steering clear of entire regions as a result (France 24, 2025). This isn't just a vibe, either — the State Department has kept a worldwide caution advisory active, warning that locations tied to Americans have become real targets amid rising regional tensions (U.S. Department of State, 2026). Travel advisors now routinely tell people to downplay being American, keep a low profile, check local sentiment before heading out. That's genuinely new guidance. It didn't exist in this form a generation ago (Washington Post, 2025). For a country that's built so much of its identity around freedom of movement and global standing, that shrinking sense of welcome abroad is its own quiet loss, and it stacks right on top of everything else already on this list.</w:t>
+      </w:r>
+    </w:p>
+    <w:p>
+      <w:r>
+        <w:t>None of these layers cancel each other out. That's really the point. A person can be carrying inherited trauma from something that happened to their great-grandparents, grief from a pandemic death last year, and low-grade hypervigilance from just living in a country where mass shootings are routine — all three, at once, in the same body. That's the real picture. Not tidy. Not resolved. Just layered.</w:t>
       </w:r>
     </w:p>
     <w:p>
@@ -6543,7 +6613,7 @@
         <w:t>Reference:</w:t>
       </w:r>
       <w:r>
-        <w:t xml:space="preserve"> Gameon, J. A., &amp; Skewes, M. C. (2019). A systematic review of trauma interventions in Native communities. PMC. https://pmc.ncbi.nlm.nih.gov/articles/PMC7243818/</w:t>
+        <w:t xml:space="preserve"> Journal of Ethics, American Medical Association. (2021). What does it mean to heal from historical trauma? AMA Journal of Ethics, 23(6). https://journalofethics.ama-assn.org/article/what-does-it-mean-heal-historical-trauma/2021-06</w:t>
       </w:r>
     </w:p>
     <w:p>

</xml_diff>